<commit_message>
Changes related to EHIS-3274
</commit_message>
<xml_diff>
--- a/PHOCS-Docgentemplates/PHOCS Dairy Worker Licence Template_V0.1.docx
+++ b/PHOCS-Docgentemplates/PHOCS Dairy Worker Licence Template_V0.1.docx
@@ -424,7 +424,6 @@
         <w:spacing w:before="0" w:beforeAutospacing="0" w:after="0" w:afterAutospacing="0"/>
         <w:textAlignment w:val="baseline"/>
         <w:rPr>
-          <w:rStyle w:val="normaltextrun"/>
           <w:rFonts w:ascii="Arial" w:eastAsia="Arial" w:hAnsi="Arial" w:cs="Arial"/>
           <w:i/>
           <w:color w:val="0E2841" w:themeColor="text2"/>
@@ -441,6 +440,23 @@
       <w:r>
         <w:t xml:space="preserve"> </w:t>
       </w:r>
+    </w:p>
+    <w:p>
+      <w:pPr>
+        <w:pStyle w:val="NormalWeb"/>
+        <w:numPr>
+          <w:ilvl w:val="0"/>
+          <w:numId w:val="17"/>
+        </w:numPr>
+        <w:spacing w:before="0" w:beforeAutospacing="0" w:after="0" w:afterAutospacing="0"/>
+        <w:textAlignment w:val="baseline"/>
+        <w:rPr>
+          <w:rStyle w:val="normaltextrun"/>
+          <w:rFonts w:ascii="Arial" w:eastAsia="Arial" w:hAnsi="Arial" w:cs="Arial"/>
+          <w:i/>
+          <w:color w:val="0E2841" w:themeColor="text2"/>
+        </w:rPr>
+      </w:pPr>
       <w:r>
         <w:rPr>
           <w:rStyle w:val="normaltextrun"/>
@@ -4311,6 +4327,7 @@
   <w:style w:type="character" w:default="1" w:styleId="DefaultParagraphFont">
     <w:name w:val="Default Paragraph Font"/>
     <w:uiPriority w:val="1"/>
+    <w:semiHidden/>
     <w:unhideWhenUsed/>
   </w:style>
   <w:style w:type="table" w:default="1" w:styleId="TableNormal">
@@ -5127,6 +5144,10 @@
 </file>
 
 <file path=customXml/item1.xml><?xml version="1.0" encoding="utf-8"?>
+<b:Sources xmlns:b="http://schemas.openxmlformats.org/officeDocument/2006/bibliography" xmlns="http://schemas.openxmlformats.org/officeDocument/2006/bibliography" SelectedStyle="\APASixthEditionOfficeOnline.xsl" StyleName="APA" Version="6"/>
+</file>
+
+<file path=customXml/item2.xml><?xml version="1.0" encoding="utf-8"?>
 <ct:contentTypeSchema xmlns:ct="http://schemas.microsoft.com/office/2006/metadata/contentType" xmlns:ma="http://schemas.microsoft.com/office/2006/metadata/properties/metaAttributes" ct:_="" ma:_="" ma:contentTypeName="Document" ma:contentTypeID="0x01010015F16144C0593A4A82C8AE0B67DB460F" ma:contentTypeVersion="11" ma:contentTypeDescription="Create a new document." ma:contentTypeScope="" ma:versionID="3a2406281bee02c64b898b19359b591a">
   <xsd:schema xmlns:xsd="http://www.w3.org/2001/XMLSchema" xmlns:xs="http://www.w3.org/2001/XMLSchema" xmlns:p="http://schemas.microsoft.com/office/2006/metadata/properties" xmlns:ns2="94d5cf59-5162-48bc-aa9b-620df72947f5" xmlns:ns3="8350b7c0-334b-4e19-bfc1-744f6a979eee" targetNamespace="http://schemas.microsoft.com/office/2006/metadata/properties" ma:root="true" ma:fieldsID="a1c36f1dd46451d6740df434f8fe57b2" ns2:_="" ns3:_="">
     <xsd:import namespace="94d5cf59-5162-48bc-aa9b-620df72947f5"/>
@@ -5321,11 +5342,16 @@
 </ct:contentTypeSchema>
 </file>
 
-<file path=customXml/item2.xml><?xml version="1.0" encoding="utf-8"?>
-<b:Sources xmlns:b="http://schemas.openxmlformats.org/officeDocument/2006/bibliography" xmlns="http://schemas.openxmlformats.org/officeDocument/2006/bibliography" SelectedStyle="\APASixthEditionOfficeOnline.xsl" StyleName="APA" Version="6"/>
+<file path=customXml/item3.xml><?xml version="1.0" encoding="utf-8"?>
+<?mso-contentType ?>
+<FormTemplates xmlns="http://schemas.microsoft.com/sharepoint/v3/contenttype/forms">
+  <Display>DocumentLibraryForm</Display>
+  <Edit>DocumentLibraryForm</Edit>
+  <New>DocumentLibraryForm</New>
+</FormTemplates>
 </file>
 
-<file path=customXml/item3.xml><?xml version="1.0" encoding="utf-8"?>
+<file path=customXml/item4.xml><?xml version="1.0" encoding="utf-8"?>
 <p:properties xmlns:p="http://schemas.microsoft.com/office/2006/metadata/properties" xmlns:xsi="http://www.w3.org/2001/XMLSchema-instance" xmlns:pc="http://schemas.microsoft.com/office/infopath/2007/PartnerControls">
   <documentManagement>
     <TaxCatchAll xmlns="8350b7c0-334b-4e19-bfc1-744f6a979eee" xsi:nil="true"/>
@@ -5336,16 +5362,15 @@
 </p:properties>
 </file>
 
-<file path=customXml/item4.xml><?xml version="1.0" encoding="utf-8"?>
-<?mso-contentType ?>
-<FormTemplates xmlns="http://schemas.microsoft.com/sharepoint/v3/contenttype/forms">
-  <Display>DocumentLibraryForm</Display>
-  <Edit>DocumentLibraryForm</Edit>
-  <New>DocumentLibraryForm</New>
-</FormTemplates>
+<file path=customXml/itemProps1.xml><?xml version="1.0" encoding="utf-8"?>
+<ds:datastoreItem xmlns:ds="http://schemas.openxmlformats.org/officeDocument/2006/customXml" ds:itemID="{05547FD2-9942-43BC-9F0A-00017A93FCEF}">
+  <ds:schemaRefs>
+    <ds:schemaRef ds:uri="http://schemas.openxmlformats.org/officeDocument/2006/bibliography"/>
+  </ds:schemaRefs>
+</ds:datastoreItem>
 </file>
 
-<file path=customXml/itemProps1.xml><?xml version="1.0" encoding="utf-8"?>
+<file path=customXml/itemProps2.xml><?xml version="1.0" encoding="utf-8"?>
 <ds:datastoreItem xmlns:ds="http://schemas.openxmlformats.org/officeDocument/2006/customXml" ds:itemID="{F0E499C4-B224-4C0A-B8BF-25B7CEA155C9}">
   <ds:schemaRefs>
     <ds:schemaRef ds:uri="http://schemas.microsoft.com/office/2006/metadata/contentType"/>
@@ -5364,15 +5389,15 @@
 </ds:datastoreItem>
 </file>
 
-<file path=customXml/itemProps2.xml><?xml version="1.0" encoding="utf-8"?>
-<ds:datastoreItem xmlns:ds="http://schemas.openxmlformats.org/officeDocument/2006/customXml" ds:itemID="{05547FD2-9942-43BC-9F0A-00017A93FCEF}">
+<file path=customXml/itemProps3.xml><?xml version="1.0" encoding="utf-8"?>
+<ds:datastoreItem xmlns:ds="http://schemas.openxmlformats.org/officeDocument/2006/customXml" ds:itemID="{EBC42ABD-C067-4102-BEC1-787B36D5DB6C}">
   <ds:schemaRefs>
-    <ds:schemaRef ds:uri="http://schemas.openxmlformats.org/officeDocument/2006/bibliography"/>
+    <ds:schemaRef ds:uri="http://schemas.microsoft.com/sharepoint/v3/contenttype/forms"/>
   </ds:schemaRefs>
 </ds:datastoreItem>
 </file>
 
-<file path=customXml/itemProps3.xml><?xml version="1.0" encoding="utf-8"?>
+<file path=customXml/itemProps4.xml><?xml version="1.0" encoding="utf-8"?>
 <ds:datastoreItem xmlns:ds="http://schemas.openxmlformats.org/officeDocument/2006/customXml" ds:itemID="{025C8078-51DC-4841-BA80-19788F4265C1}">
   <ds:schemaRefs>
     <ds:schemaRef ds:uri="http://schemas.microsoft.com/office/2006/metadata/properties"/>
@@ -5383,14 +5408,6 @@
 </ds:datastoreItem>
 </file>
 
-<file path=customXml/itemProps4.xml><?xml version="1.0" encoding="utf-8"?>
-<ds:datastoreItem xmlns:ds="http://schemas.openxmlformats.org/officeDocument/2006/customXml" ds:itemID="{EBC42ABD-C067-4102-BEC1-787B36D5DB6C}">
-  <ds:schemaRefs>
-    <ds:schemaRef ds:uri="http://schemas.microsoft.com/sharepoint/v3/contenttype/forms"/>
-  </ds:schemaRefs>
-</ds:datastoreItem>
-</file>
-
 <file path=docMetadata/LabelInfo.xml><?xml version="1.0" encoding="utf-8"?>
 <clbl:labelList xmlns:clbl="http://schemas.microsoft.com/office/2020/mipLabelMetadata">
   <clbl:label id="{e0793d39-0939-496d-b129-198edd916feb}" enabled="0" method="" siteId="{e0793d39-0939-496d-b129-198edd916feb}" removed="1"/>

</xml_diff>